<commit_message>
docs: atualizar 4 manuais com patches Colab + setup_data_colab.py
- MANUAL_UI: nova opção 4 (Colab) + 3 patches documentados
- TECHCHALLENGE_FASE3_PROJETO_COMPLETO: 8 itens marcados como FEITO + seção 12.7
- RELATORIO_TECNICO_PARA_EQUIPE: 8 itens marcados como FEITO + seção 12.6
- GUIA_DATASETS: nova seção 'Setup Automático' no topo

DOCX regenerados a partir dos MDs atualizados
</commit_message>
<xml_diff>
--- a/docs/GUIA_DATASETS.docx
+++ b/docs/GUIA_DATASETS.docx
@@ -23,6 +23,126 @@
           <w:color w:val="555555"/>
         </w:rPr>
         <w:t>┃ Lista completa de datasets públicos que você precisa baixar, com links diretos e instruções.</w:t>
+      </w:r>
+    </w:p>
+    <w:p>
+      <w:pPr>
+        <w:pStyle w:val="Heading2"/>
+      </w:pPr>
+      <w:r>
+        <w:rPr>
+          <w:color w:val="2E74B5"/>
+        </w:rPr>
+        <w:t>⚡ Setup Automático (⭐ RECOMENDADO)</w:t>
+      </w:r>
+    </w:p>
+    <w:p>
+      <w:r>
+        <w:rPr>
+          <w:rFonts w:ascii="Consolas" w:hAnsi="Consolas"/>
+          <w:sz w:val="18"/>
+        </w:rPr>
+        <w:t># Baixa automaticamente TODOS os datasets públicos</w:t>
+        <w:br/>
+        <w:t>python scripts/setup_data_colab.py</w:t>
+      </w:r>
+    </w:p>
+    <w:p>
+      <w:r>
+        <w:rPr>
+          <w:b/>
+        </w:rPr>
+        <w:t>O que baixa</w:t>
+      </w:r>
+      <w:r>
+        <w:t>:</w:t>
+      </w:r>
+    </w:p>
+    <w:p>
+      <w:pPr>
+        <w:pStyle w:val="ListBullet"/>
+      </w:pPr>
+      <w:r>
+        <w:t xml:space="preserve">✅ </w:t>
+      </w:r>
+      <w:r>
+        <w:rPr>
+          <w:b/>
+        </w:rPr>
+        <w:t>MedQuAD</w:t>
+      </w:r>
+      <w:r>
+        <w:t xml:space="preserve"> (NIH público, ~17k pares Q&amp;A médicos EN)</w:t>
+      </w:r>
+    </w:p>
+    <w:p>
+      <w:pPr>
+        <w:pStyle w:val="ListBullet"/>
+      </w:pPr>
+      <w:r>
+        <w:t xml:space="preserve">✅ </w:t>
+      </w:r>
+      <w:r>
+        <w:rPr>
+          <w:b/>
+        </w:rPr>
+        <w:t>ChatBulário</w:t>
+      </w:r>
+      <w:r>
+        <w:t xml:space="preserve"> (HuggingFace, 68k pares Q&amp;A bulas PT-BR)</w:t>
+      </w:r>
+    </w:p>
+    <w:p>
+      <w:pPr>
+        <w:pStyle w:val="ListBullet"/>
+      </w:pPr>
+      <w:r>
+        <w:t xml:space="preserve">✅ </w:t>
+      </w:r>
+      <w:r>
+        <w:rPr>
+          <w:b/>
+        </w:rPr>
+        <w:t>CID-10</w:t>
+      </w:r>
+      <w:r>
+        <w:t xml:space="preserve"> (DATASUS público, fallback 100 doenças se URL falhar)</w:t>
+      </w:r>
+    </w:p>
+    <w:p>
+      <w:pPr>
+        <w:pStyle w:val="ListBullet"/>
+      </w:pPr>
+      <w:r>
+        <w:t xml:space="preserve">✅ </w:t>
+      </w:r>
+      <w:r>
+        <w:rPr>
+          <w:b/>
+        </w:rPr>
+        <w:t>Synthetic Clinical Notes</w:t>
+      </w:r>
+      <w:r>
+        <w:t xml:space="preserve"> (HuggingFace, 3k notas)</w:t>
+      </w:r>
+    </w:p>
+    <w:p>
+      <w:r>
+        <w:rPr>
+          <w:b/>
+        </w:rPr>
+        <w:t>Tempo</w:t>
+      </w:r>
+      <w:r>
+        <w:t>: ~10 min</w:t>
+      </w:r>
+    </w:p>
+    <w:p>
+      <w:r>
+        <w:rPr>
+          <w:color w:val="CCCCCC"/>
+        </w:rPr>
+        <w:t>────────────────────────────────────────────────────────────</w:t>
       </w:r>
     </w:p>
     <w:p>

</xml_diff>

<commit_message>
docs: remover menções a datasets deletados (PubMedQA, ANVISA, PMC, RxNorm)
GUIA_DATASETS.md:
- Removidas seções 1 (PubMedQA), 2 (PMC), 3 (ANVISA antiga), 6 (RxNorm), 7 (DrugBank)
- Adicionadas notas REMOVIDO set/2026 nas tabelas
- Plano de ação agora focado no scripts/setup_data_colab.py
- Estrutura de pastas reflete o estado real (4 datasets ativos)

README.md:
- 'PubMed Central' -> 'ChatBulário' na descrição
- 'base interna do hospital' -> 'códigos CID-10 + notas clínicas sintéticas'

RELATORIO_TECNICO_PARA_EQUIPE.md:
- Removida linha de PubMedQA
- 'PubMedQA artificial' -> 'TonicAI/synthetic_clinical_notes'
- 'Download ANVISA + CID-10 + PubMedQA' -> 4 datasets corretos
- 'build_index_local.py' -> 'build_index_chatbulario.py 10000'

TECHCHALLENGE_FASE3_PROJETO_COMPLETO.md:
- Removida PubMedQA da tabela
- Lista de downloads sem PubMedQA

DOCX regenerados.
</commit_message>
<xml_diff>
--- a/docs/GUIA_DATASETS.docx
+++ b/docs/GUIA_DATASETS.docx
@@ -153,7 +153,7 @@
         <w:rPr>
           <w:color w:val="2E74B5"/>
         </w:rPr>
-        <w:t>🎯 Status atual</w:t>
+        <w:t>🎯 Status atual (set/2026)</w:t>
       </w:r>
     </w:p>
     <w:tbl>
@@ -163,15 +163,16 @@
         <w:tblLook w:firstColumn="1" w:firstRow="1" w:lastColumn="0" w:lastRow="0" w:noHBand="0" w:noVBand="1" w:val="04A0"/>
       </w:tblPr>
       <w:tblGrid>
-        <w:gridCol w:w="2160"/>
-        <w:gridCol w:w="2160"/>
-        <w:gridCol w:w="2160"/>
-        <w:gridCol w:w="2160"/>
+        <w:gridCol w:w="1728"/>
+        <w:gridCol w:w="1728"/>
+        <w:gridCol w:w="1728"/>
+        <w:gridCol w:w="1728"/>
+        <w:gridCol w:w="1728"/>
       </w:tblGrid>
       <w:tr>
         <w:tc>
           <w:tcPr>
-            <w:tcW w:type="dxa" w:w="2160"/>
+            <w:tcW w:type="dxa" w:w="1728"/>
             <w:shd w:fill="1F497D"/>
           </w:tcPr>
           <w:p>
@@ -188,7 +189,7 @@
         </w:tc>
         <w:tc>
           <w:tcPr>
-            <w:tcW w:type="dxa" w:w="2160"/>
+            <w:tcW w:type="dxa" w:w="1728"/>
             <w:shd w:fill="1F497D"/>
           </w:tcPr>
           <w:p>
@@ -205,7 +206,7 @@
         </w:tc>
         <w:tc>
           <w:tcPr>
-            <w:tcW w:type="dxa" w:w="2160"/>
+            <w:tcW w:type="dxa" w:w="1728"/>
             <w:shd w:fill="1F497D"/>
           </w:tcPr>
           <w:p>
@@ -222,7 +223,7 @@
         </w:tc>
         <w:tc>
           <w:tcPr>
-            <w:tcW w:type="dxa" w:w="2160"/>
+            <w:tcW w:type="dxa" w:w="1728"/>
             <w:shd w:fill="1F497D"/>
           </w:tcPr>
           <w:p>
@@ -233,7 +234,24 @@
                 <w:color w:val="FFFFFF"/>
                 <w:sz w:val="20"/>
               </w:rPr>
-              <w:t>Uso no projeto</w:t>
+              <w:t>Onde baixar</w:t>
+            </w:r>
+          </w:p>
+        </w:tc>
+        <w:tc>
+          <w:tcPr>
+            <w:tcW w:type="dxa" w:w="1728"/>
+            <w:shd w:fill="1F497D"/>
+          </w:tcPr>
+          <w:p>
+            <w:r/>
+            <w:r>
+              <w:rPr>
+                <w:b/>
+                <w:color w:val="FFFFFF"/>
+                <w:sz w:val="20"/>
+              </w:rPr>
+              <w:t>Uso</w:t>
             </w:r>
           </w:p>
         </w:tc>
@@ -241,7 +259,7 @@
       <w:tr>
         <w:tc>
           <w:tcPr>
-            <w:tcW w:type="dxa" w:w="2160"/>
+            <w:tcW w:type="dxa" w:w="1728"/>
           </w:tcPr>
           <w:p>
             <w:r>
@@ -259,7 +277,7 @@
         </w:tc>
         <w:tc>
           <w:tcPr>
-            <w:tcW w:type="dxa" w:w="2160"/>
+            <w:tcW w:type="dxa" w:w="1728"/>
           </w:tcPr>
           <w:p>
             <w:r>
@@ -278,7 +296,7 @@
         </w:tc>
         <w:tc>
           <w:tcPr>
-            <w:tcW w:type="dxa" w:w="2160"/>
+            <w:tcW w:type="dxa" w:w="1728"/>
           </w:tcPr>
           <w:p>
             <w:r>
@@ -290,20 +308,51 @@
               <w:rPr>
                 <w:sz w:val="18"/>
               </w:rPr>
-              <w:t xml:space="preserve">JÁ TEM em </w:t>
+              <w:t xml:space="preserve">Baixar via </w:t>
             </w:r>
             <w:r>
               <w:rPr>
                 <w:rFonts w:ascii="Consolas" w:hAnsi="Consolas"/>
                 <w:sz w:val="18"/>
               </w:rPr>
-              <w:t>Downloads/dataset/medquad_finetuning.jsonl</w:t>
+              <w:t>scripts/setup_data_colab.py</w:t>
+            </w:r>
+            <w:r>
+              <w:rPr>
+                <w:sz w:val="18"/>
+              </w:rPr>
+              <w:t xml:space="preserve"> ou </w:t>
+            </w:r>
+            <w:r>
+              <w:rPr>
+                <w:rFonts w:ascii="Consolas" w:hAnsi="Consolas"/>
+                <w:sz w:val="18"/>
+              </w:rPr>
+              <w:t>git clone https://github.com/abachaa/MedQuAD</w:t>
             </w:r>
           </w:p>
         </w:tc>
         <w:tc>
           <w:tcPr>
-            <w:tcW w:type="dxa" w:w="2160"/>
+            <w:tcW w:type="dxa" w:w="1728"/>
+          </w:tcPr>
+          <w:p>
+            <w:r>
+              <w:rPr>
+                <w:sz w:val="18"/>
+              </w:rPr>
+            </w:r>
+            <w:r>
+              <w:rPr>
+                <w:sz w:val="18"/>
+              </w:rPr>
+              <w:t>NIH (público)</w:t>
+            </w:r>
+          </w:p>
+        </w:tc>
+        <w:tc>
+          <w:tcPr>
+            <w:tcW w:type="dxa" w:w="1728"/>
           </w:tcPr>
           <w:p>
             <w:r>
@@ -323,7 +372,7 @@
       <w:tr>
         <w:tc>
           <w:tcPr>
-            <w:tcW w:type="dxa" w:w="2160"/>
+            <w:tcW w:type="dxa" w:w="1728"/>
           </w:tcPr>
           <w:p>
             <w:r>
@@ -341,239 +390,7 @@
         </w:tc>
         <w:tc>
           <w:tcPr>
-            <w:tcW w:type="dxa" w:w="2160"/>
-          </w:tcPr>
-          <w:p>
-            <w:r>
-              <w:rPr>
-                <w:sz w:val="18"/>
-              </w:rPr>
-            </w:r>
-            <w:r>
-              <w:rPr>
-                <w:b/>
-                <w:sz w:val="18"/>
-              </w:rPr>
-              <w:t>LiveQA-Med</w:t>
-            </w:r>
-          </w:p>
-        </w:tc>
-        <w:tc>
-          <w:tcPr>
-            <w:tcW w:type="dxa" w:w="2160"/>
-          </w:tcPr>
-          <w:p>
-            <w:r>
-              <w:rPr>
-                <w:sz w:val="18"/>
-              </w:rPr>
-            </w:r>
-            <w:r>
-              <w:rPr>
-                <w:sz w:val="18"/>
-              </w:rPr>
-              <w:t xml:space="preserve">JÁ TEM em </w:t>
-            </w:r>
-            <w:r>
-              <w:rPr>
-                <w:rFonts w:ascii="Consolas" w:hAnsi="Consolas"/>
-                <w:sz w:val="18"/>
-              </w:rPr>
-              <w:t>QA-TestSet-LiveQA-Med-Qrels-2479-Answers/</w:t>
-            </w:r>
-          </w:p>
-        </w:tc>
-        <w:tc>
-          <w:tcPr>
-            <w:tcW w:type="dxa" w:w="2160"/>
-          </w:tcPr>
-          <w:p>
-            <w:r>
-              <w:rPr>
-                <w:sz w:val="18"/>
-              </w:rPr>
-            </w:r>
-            <w:r>
-              <w:rPr>
-                <w:sz w:val="18"/>
-              </w:rPr>
-              <w:t>Avaliar RAG</w:t>
-            </w:r>
-          </w:p>
-        </w:tc>
-      </w:tr>
-      <w:tr>
-        <w:tc>
-          <w:tcPr>
-            <w:tcW w:type="dxa" w:w="2160"/>
-          </w:tcPr>
-          <w:p>
-            <w:r>
-              <w:rPr>
-                <w:sz w:val="18"/>
-              </w:rPr>
-            </w:r>
-            <w:r>
-              <w:rPr>
-                <w:sz w:val="18"/>
-              </w:rPr>
-              <w:t>✅</w:t>
-            </w:r>
-          </w:p>
-        </w:tc>
-        <w:tc>
-          <w:tcPr>
-            <w:tcW w:type="dxa" w:w="2160"/>
-          </w:tcPr>
-          <w:p>
-            <w:r>
-              <w:rPr>
-                <w:sz w:val="18"/>
-              </w:rPr>
-            </w:r>
-            <w:r>
-              <w:rPr>
-                <w:b/>
-                <w:sz w:val="18"/>
-              </w:rPr>
-              <w:t>PubMedQA</w:t>
-            </w:r>
-          </w:p>
-        </w:tc>
-        <w:tc>
-          <w:tcPr>
-            <w:tcW w:type="dxa" w:w="2160"/>
-          </w:tcPr>
-          <w:p>
-            <w:r>
-              <w:rPr>
-                <w:sz w:val="18"/>
-              </w:rPr>
-            </w:r>
-            <w:r>
-              <w:rPr>
-                <w:sz w:val="18"/>
-              </w:rPr>
-              <w:t>JÁ BAIXADO (HuggingFace)</w:t>
-            </w:r>
-          </w:p>
-        </w:tc>
-        <w:tc>
-          <w:tcPr>
-            <w:tcW w:type="dxa" w:w="2160"/>
-          </w:tcPr>
-          <w:p>
-            <w:r>
-              <w:rPr>
-                <w:sz w:val="18"/>
-              </w:rPr>
-            </w:r>
-            <w:r>
-              <w:rPr>
-                <w:sz w:val="18"/>
-              </w:rPr>
-              <w:t>Complementar fine-tuning</w:t>
-            </w:r>
-          </w:p>
-        </w:tc>
-      </w:tr>
-      <w:tr>
-        <w:tc>
-          <w:tcPr>
-            <w:tcW w:type="dxa" w:w="2160"/>
-          </w:tcPr>
-          <w:p>
-            <w:r>
-              <w:rPr>
-                <w:sz w:val="18"/>
-              </w:rPr>
-            </w:r>
-            <w:r>
-              <w:rPr>
-                <w:sz w:val="18"/>
-              </w:rPr>
-              <w:t>🔲</w:t>
-            </w:r>
-          </w:p>
-        </w:tc>
-        <w:tc>
-          <w:tcPr>
-            <w:tcW w:type="dxa" w:w="2160"/>
-          </w:tcPr>
-          <w:p>
-            <w:r>
-              <w:rPr>
-                <w:sz w:val="18"/>
-              </w:rPr>
-            </w:r>
-            <w:r>
-              <w:rPr>
-                <w:b/>
-                <w:sz w:val="18"/>
-              </w:rPr>
-              <w:t>PMC Open Access Subset</w:t>
-            </w:r>
-          </w:p>
-        </w:tc>
-        <w:tc>
-          <w:tcPr>
-            <w:tcW w:type="dxa" w:w="2160"/>
-          </w:tcPr>
-          <w:p>
-            <w:r>
-              <w:rPr>
-                <w:sz w:val="18"/>
-              </w:rPr>
-            </w:r>
-            <w:r>
-              <w:rPr>
-                <w:sz w:val="18"/>
-              </w:rPr>
-              <w:t>OPCIONAL (subset)</w:t>
-            </w:r>
-          </w:p>
-        </w:tc>
-        <w:tc>
-          <w:tcPr>
-            <w:tcW w:type="dxa" w:w="2160"/>
-          </w:tcPr>
-          <w:p>
-            <w:r>
-              <w:rPr>
-                <w:sz w:val="18"/>
-              </w:rPr>
-            </w:r>
-            <w:r>
-              <w:rPr>
-                <w:sz w:val="18"/>
-              </w:rPr>
-              <w:t>RAG #1 literatura</w:t>
-            </w:r>
-          </w:p>
-        </w:tc>
-      </w:tr>
-      <w:tr>
-        <w:tc>
-          <w:tcPr>
-            <w:tcW w:type="dxa" w:w="2160"/>
-          </w:tcPr>
-          <w:p>
-            <w:r>
-              <w:rPr>
-                <w:sz w:val="18"/>
-              </w:rPr>
-            </w:r>
-            <w:r>
-              <w:rPr>
-                <w:sz w:val="18"/>
-              </w:rPr>
-              <w:t>✅</w:t>
-            </w:r>
-          </w:p>
-        </w:tc>
-        <w:tc>
-          <w:tcPr>
-            <w:tcW w:type="dxa" w:w="2160"/>
+            <w:tcW w:type="dxa" w:w="1728"/>
           </w:tcPr>
           <w:p>
             <w:r>
@@ -598,7 +415,63 @@
         </w:tc>
         <w:tc>
           <w:tcPr>
-            <w:tcW w:type="dxa" w:w="2160"/>
+            <w:tcW w:type="dxa" w:w="1728"/>
+          </w:tcPr>
+          <w:p>
+            <w:r>
+              <w:rPr>
+                <w:sz w:val="18"/>
+              </w:rPr>
+            </w:r>
+            <w:r>
+              <w:rPr>
+                <w:sz w:val="18"/>
+              </w:rPr>
+              <w:t xml:space="preserve">Baixar via </w:t>
+            </w:r>
+            <w:r>
+              <w:rPr>
+                <w:rFonts w:ascii="Consolas" w:hAnsi="Consolas"/>
+                <w:sz w:val="18"/>
+              </w:rPr>
+              <w:t>scripts/setup_data_colab.py</w:t>
+            </w:r>
+            <w:r>
+              <w:rPr>
+                <w:sz w:val="18"/>
+              </w:rPr>
+              <w:t xml:space="preserve"> ou </w:t>
+            </w:r>
+            <w:r>
+              <w:rPr>
+                <w:rFonts w:ascii="Consolas" w:hAnsi="Consolas"/>
+                <w:sz w:val="18"/>
+              </w:rPr>
+              <w:t>load_dataset("walmeidadf/ChatBulario")</w:t>
+            </w:r>
+          </w:p>
+        </w:tc>
+        <w:tc>
+          <w:tcPr>
+            <w:tcW w:type="dxa" w:w="1728"/>
+          </w:tcPr>
+          <w:p>
+            <w:r>
+              <w:rPr>
+                <w:sz w:val="18"/>
+              </w:rPr>
+            </w:r>
+            <w:r>
+              <w:rPr>
+                <w:sz w:val="18"/>
+              </w:rPr>
+              <w:t>HuggingFace</w:t>
+            </w:r>
+          </w:p>
+        </w:tc>
+        <w:tc>
+          <w:tcPr>
+            <w:tcW w:type="dxa" w:w="1728"/>
           </w:tcPr>
           <w:p>
             <w:r>
@@ -611,39 +484,7 @@
                 <w:b/>
                 <w:sz w:val="18"/>
               </w:rPr>
-              <w:t>JÁ BAIXADO</w:t>
-            </w:r>
-            <w:r>
-              <w:rPr>
-                <w:sz w:val="18"/>
-              </w:rPr>
-              <w:t xml:space="preserve"> em </w:t>
-            </w:r>
-            <w:r>
-              <w:rPr>
-                <w:rFonts w:ascii="Consolas" w:hAnsi="Consolas"/>
-                <w:sz w:val="18"/>
-              </w:rPr>
-              <w:t>data/raw/chatbulario_*.jsonl</w:t>
-            </w:r>
-          </w:p>
-        </w:tc>
-        <w:tc>
-          <w:tcPr>
-            <w:tcW w:type="dxa" w:w="2160"/>
-          </w:tcPr>
-          <w:p>
-            <w:r>
-              <w:rPr>
-                <w:sz w:val="18"/>
-              </w:rPr>
-            </w:r>
-            <w:r>
-              <w:rPr>
-                <w:b/>
-                <w:sz w:val="18"/>
-              </w:rPr>
-              <w:t>RAG #2 interno (medicamentos)</w:t>
+              <w:t>RAG #1 (bulas PT-BR)</w:t>
             </w:r>
           </w:p>
         </w:tc>
@@ -651,7 +492,7 @@
       <w:tr>
         <w:tc>
           <w:tcPr>
-            <w:tcW w:type="dxa" w:w="2160"/>
+            <w:tcW w:type="dxa" w:w="1728"/>
           </w:tcPr>
           <w:p>
             <w:r>
@@ -669,7 +510,7 @@
         </w:tc>
         <w:tc>
           <w:tcPr>
-            <w:tcW w:type="dxa" w:w="2160"/>
+            <w:tcW w:type="dxa" w:w="1728"/>
           </w:tcPr>
           <w:p>
             <w:r>
@@ -688,7 +529,7 @@
         </w:tc>
         <w:tc>
           <w:tcPr>
-            <w:tcW w:type="dxa" w:w="2160"/>
+            <w:tcW w:type="dxa" w:w="1728"/>
           </w:tcPr>
           <w:p>
             <w:r>
@@ -700,13 +541,20 @@
               <w:rPr>
                 <w:sz w:val="18"/>
               </w:rPr>
-              <w:t>JÁ BAIXADO</w:t>
+              <w:t xml:space="preserve">Baixar via </w:t>
+            </w:r>
+            <w:r>
+              <w:rPr>
+                <w:rFonts w:ascii="Consolas" w:hAnsi="Consolas"/>
+                <w:sz w:val="18"/>
+              </w:rPr>
+              <w:t>scripts/setup_data_colab.py</w:t>
             </w:r>
           </w:p>
         </w:tc>
         <w:tc>
           <w:tcPr>
-            <w:tcW w:type="dxa" w:w="2160"/>
+            <w:tcW w:type="dxa" w:w="1728"/>
           </w:tcPr>
           <w:p>
             <w:r>
@@ -718,7 +566,25 @@
               <w:rPr>
                 <w:sz w:val="18"/>
               </w:rPr>
-              <w:t>RAG #2 interno / fine-tuning</w:t>
+              <w:t>TonicAI/HuggingFace</w:t>
+            </w:r>
+          </w:p>
+        </w:tc>
+        <w:tc>
+          <w:tcPr>
+            <w:tcW w:type="dxa" w:w="1728"/>
+          </w:tcPr>
+          <w:p>
+            <w:r>
+              <w:rPr>
+                <w:sz w:val="18"/>
+              </w:rPr>
+            </w:r>
+            <w:r>
+              <w:rPr>
+                <w:sz w:val="18"/>
+              </w:rPr>
+              <w:t>RAG #3 (notas SOAP)</w:t>
             </w:r>
           </w:p>
         </w:tc>
@@ -726,7 +592,7 @@
       <w:tr>
         <w:tc>
           <w:tcPr>
-            <w:tcW w:type="dxa" w:w="2160"/>
+            <w:tcW w:type="dxa" w:w="1728"/>
           </w:tcPr>
           <w:p>
             <w:r>
@@ -744,7 +610,7 @@
         </w:tc>
         <w:tc>
           <w:tcPr>
-            <w:tcW w:type="dxa" w:w="2160"/>
+            <w:tcW w:type="dxa" w:w="1728"/>
           </w:tcPr>
           <w:p>
             <w:r>
@@ -763,7 +629,7 @@
         </w:tc>
         <w:tc>
           <w:tcPr>
-            <w:tcW w:type="dxa" w:w="2160"/>
+            <w:tcW w:type="dxa" w:w="1728"/>
           </w:tcPr>
           <w:p>
             <w:r>
@@ -775,13 +641,26 @@
               <w:rPr>
                 <w:sz w:val="18"/>
               </w:rPr>
-              <w:t>JÁ BAIXADO</w:t>
+              <w:t xml:space="preserve">Baixar via </w:t>
+            </w:r>
+            <w:r>
+              <w:rPr>
+                <w:rFonts w:ascii="Consolas" w:hAnsi="Consolas"/>
+                <w:sz w:val="18"/>
+              </w:rPr>
+              <w:t>scripts/setup_data_colab.py</w:t>
+            </w:r>
+            <w:r>
+              <w:rPr>
+                <w:sz w:val="18"/>
+              </w:rPr>
+              <w:t xml:space="preserve"> (fallback: 100 doenças comuns)</w:t>
             </w:r>
           </w:p>
         </w:tc>
         <w:tc>
           <w:tcPr>
-            <w:tcW w:type="dxa" w:w="2160"/>
+            <w:tcW w:type="dxa" w:w="1728"/>
           </w:tcPr>
           <w:p>
             <w:r>
@@ -793,7 +672,25 @@
               <w:rPr>
                 <w:sz w:val="18"/>
               </w:rPr>
-              <w:t>Mapeamento de doenças (PT-BR)</w:t>
+              <w:t>DATASUS (público)</w:t>
+            </w:r>
+          </w:p>
+        </w:tc>
+        <w:tc>
+          <w:tcPr>
+            <w:tcW w:type="dxa" w:w="1728"/>
+          </w:tcPr>
+          <w:p>
+            <w:r>
+              <w:rPr>
+                <w:sz w:val="18"/>
+              </w:rPr>
+            </w:r>
+            <w:r>
+              <w:rPr>
+                <w:sz w:val="18"/>
+              </w:rPr>
+              <w:t>RAG #2 (mapeamento doenças)</w:t>
             </w:r>
           </w:p>
         </w:tc>
@@ -801,7 +698,375 @@
       <w:tr>
         <w:tc>
           <w:tcPr>
-            <w:tcW w:type="dxa" w:w="2160"/>
+            <w:tcW w:type="dxa" w:w="1728"/>
+          </w:tcPr>
+          <w:p>
+            <w:r>
+              <w:rPr>
+                <w:sz w:val="18"/>
+              </w:rPr>
+            </w:r>
+            <w:r>
+              <w:rPr>
+                <w:sz w:val="18"/>
+              </w:rPr>
+              <w:t>🗑️</w:t>
+            </w:r>
+          </w:p>
+        </w:tc>
+        <w:tc>
+          <w:tcPr>
+            <w:tcW w:type="dxa" w:w="1728"/>
+          </w:tcPr>
+          <w:p>
+            <w:r>
+              <w:rPr>
+                <w:sz w:val="18"/>
+              </w:rPr>
+            </w:r>
+            <w:r>
+              <w:rPr>
+                <w:sz w:val="18"/>
+              </w:rPr>
+              <w:t>~~ANVISA Medicamentos (CSV)~~</w:t>
+            </w:r>
+          </w:p>
+        </w:tc>
+        <w:tc>
+          <w:tcPr>
+            <w:tcW w:type="dxa" w:w="1728"/>
+          </w:tcPr>
+          <w:p>
+            <w:r>
+              <w:rPr>
+                <w:sz w:val="18"/>
+              </w:rPr>
+            </w:r>
+            <w:r>
+              <w:rPr>
+                <w:sz w:val="18"/>
+              </w:rPr>
+              <w:t>~~REMOVIDO ago/2026 — substituído por ChatBulário~~</w:t>
+            </w:r>
+          </w:p>
+        </w:tc>
+        <w:tc>
+          <w:tcPr>
+            <w:tcW w:type="dxa" w:w="1728"/>
+          </w:tcPr>
+          <w:p>
+            <w:r>
+              <w:rPr>
+                <w:sz w:val="18"/>
+              </w:rPr>
+            </w:r>
+            <w:r>
+              <w:rPr>
+                <w:sz w:val="18"/>
+              </w:rPr>
+              <w:t>—</w:t>
+            </w:r>
+          </w:p>
+        </w:tc>
+        <w:tc>
+          <w:tcPr>
+            <w:tcW w:type="dxa" w:w="1728"/>
+          </w:tcPr>
+          <w:p>
+            <w:r>
+              <w:rPr>
+                <w:sz w:val="18"/>
+              </w:rPr>
+            </w:r>
+            <w:r>
+              <w:rPr>
+                <w:sz w:val="18"/>
+              </w:rPr>
+              <w:t>~~RAG metadados~~</w:t>
+            </w:r>
+          </w:p>
+        </w:tc>
+      </w:tr>
+      <w:tr>
+        <w:tc>
+          <w:tcPr>
+            <w:tcW w:type="dxa" w:w="1728"/>
+          </w:tcPr>
+          <w:p>
+            <w:r>
+              <w:rPr>
+                <w:sz w:val="18"/>
+              </w:rPr>
+            </w:r>
+            <w:r>
+              <w:rPr>
+                <w:sz w:val="18"/>
+              </w:rPr>
+              <w:t>🗑️</w:t>
+            </w:r>
+          </w:p>
+        </w:tc>
+        <w:tc>
+          <w:tcPr>
+            <w:tcW w:type="dxa" w:w="1728"/>
+          </w:tcPr>
+          <w:p>
+            <w:r>
+              <w:rPr>
+                <w:sz w:val="18"/>
+              </w:rPr>
+            </w:r>
+            <w:r>
+              <w:rPr>
+                <w:sz w:val="18"/>
+              </w:rPr>
+              <w:t>~~LiveQA-Med~~</w:t>
+            </w:r>
+          </w:p>
+        </w:tc>
+        <w:tc>
+          <w:tcPr>
+            <w:tcW w:type="dxa" w:w="1728"/>
+          </w:tcPr>
+          <w:p>
+            <w:r>
+              <w:rPr>
+                <w:sz w:val="18"/>
+              </w:rPr>
+            </w:r>
+            <w:r>
+              <w:rPr>
+                <w:sz w:val="18"/>
+              </w:rPr>
+              <w:t>~~REMOVIDO set/2026 — substituído pelos 15 testes do notebook~~</w:t>
+            </w:r>
+          </w:p>
+        </w:tc>
+        <w:tc>
+          <w:tcPr>
+            <w:tcW w:type="dxa" w:w="1728"/>
+          </w:tcPr>
+          <w:p>
+            <w:r>
+              <w:rPr>
+                <w:sz w:val="18"/>
+              </w:rPr>
+            </w:r>
+            <w:r>
+              <w:rPr>
+                <w:sz w:val="18"/>
+              </w:rPr>
+              <w:t>—</w:t>
+            </w:r>
+          </w:p>
+        </w:tc>
+        <w:tc>
+          <w:tcPr>
+            <w:tcW w:type="dxa" w:w="1728"/>
+          </w:tcPr>
+          <w:p>
+            <w:r>
+              <w:rPr>
+                <w:sz w:val="18"/>
+              </w:rPr>
+            </w:r>
+            <w:r>
+              <w:rPr>
+                <w:sz w:val="18"/>
+              </w:rPr>
+              <w:t>~~Avaliar RAG~~</w:t>
+            </w:r>
+          </w:p>
+        </w:tc>
+      </w:tr>
+      <w:tr>
+        <w:tc>
+          <w:tcPr>
+            <w:tcW w:type="dxa" w:w="1728"/>
+          </w:tcPr>
+          <w:p>
+            <w:r>
+              <w:rPr>
+                <w:sz w:val="18"/>
+              </w:rPr>
+            </w:r>
+            <w:r>
+              <w:rPr>
+                <w:sz w:val="18"/>
+              </w:rPr>
+              <w:t>🗑️</w:t>
+            </w:r>
+          </w:p>
+        </w:tc>
+        <w:tc>
+          <w:tcPr>
+            <w:tcW w:type="dxa" w:w="1728"/>
+          </w:tcPr>
+          <w:p>
+            <w:r>
+              <w:rPr>
+                <w:sz w:val="18"/>
+              </w:rPr>
+            </w:r>
+            <w:r>
+              <w:rPr>
+                <w:sz w:val="18"/>
+              </w:rPr>
+              <w:t>~~PubMedQA~~</w:t>
+            </w:r>
+          </w:p>
+        </w:tc>
+        <w:tc>
+          <w:tcPr>
+            <w:tcW w:type="dxa" w:w="1728"/>
+          </w:tcPr>
+          <w:p>
+            <w:r>
+              <w:rPr>
+                <w:sz w:val="18"/>
+              </w:rPr>
+            </w:r>
+            <w:r>
+              <w:rPr>
+                <w:sz w:val="18"/>
+              </w:rPr>
+              <w:t>~~REMOVIDO set/2026 — não usado no pipeline final~~</w:t>
+            </w:r>
+          </w:p>
+        </w:tc>
+        <w:tc>
+          <w:tcPr>
+            <w:tcW w:type="dxa" w:w="1728"/>
+          </w:tcPr>
+          <w:p>
+            <w:r>
+              <w:rPr>
+                <w:sz w:val="18"/>
+              </w:rPr>
+            </w:r>
+            <w:r>
+              <w:rPr>
+                <w:sz w:val="18"/>
+              </w:rPr>
+              <w:t>—</w:t>
+            </w:r>
+          </w:p>
+        </w:tc>
+        <w:tc>
+          <w:tcPr>
+            <w:tcW w:type="dxa" w:w="1728"/>
+          </w:tcPr>
+          <w:p>
+            <w:r>
+              <w:rPr>
+                <w:sz w:val="18"/>
+              </w:rPr>
+            </w:r>
+            <w:r>
+              <w:rPr>
+                <w:sz w:val="18"/>
+              </w:rPr>
+              <w:t>~~Complementar fine-tuning~~</w:t>
+            </w:r>
+          </w:p>
+        </w:tc>
+      </w:tr>
+      <w:tr>
+        <w:tc>
+          <w:tcPr>
+            <w:tcW w:type="dxa" w:w="1728"/>
+          </w:tcPr>
+          <w:p>
+            <w:r>
+              <w:rPr>
+                <w:sz w:val="18"/>
+              </w:rPr>
+            </w:r>
+            <w:r>
+              <w:rPr>
+                <w:sz w:val="18"/>
+              </w:rPr>
+              <w:t>🗑️</w:t>
+            </w:r>
+          </w:p>
+        </w:tc>
+        <w:tc>
+          <w:tcPr>
+            <w:tcW w:type="dxa" w:w="1728"/>
+          </w:tcPr>
+          <w:p>
+            <w:r>
+              <w:rPr>
+                <w:sz w:val="18"/>
+              </w:rPr>
+            </w:r>
+            <w:r>
+              <w:rPr>
+                <w:sz w:val="18"/>
+              </w:rPr>
+              <w:t>~~PMC Open Access~~</w:t>
+            </w:r>
+          </w:p>
+        </w:tc>
+        <w:tc>
+          <w:tcPr>
+            <w:tcW w:type="dxa" w:w="1728"/>
+          </w:tcPr>
+          <w:p>
+            <w:r>
+              <w:rPr>
+                <w:sz w:val="18"/>
+              </w:rPr>
+            </w:r>
+            <w:r>
+              <w:rPr>
+                <w:sz w:val="18"/>
+              </w:rPr>
+              <w:t>~~REMOVIDO — URL quebrada (mudou em abril/2026)~~</w:t>
+            </w:r>
+          </w:p>
+        </w:tc>
+        <w:tc>
+          <w:tcPr>
+            <w:tcW w:type="dxa" w:w="1728"/>
+          </w:tcPr>
+          <w:p>
+            <w:r>
+              <w:rPr>
+                <w:sz w:val="18"/>
+              </w:rPr>
+            </w:r>
+            <w:r>
+              <w:rPr>
+                <w:sz w:val="18"/>
+              </w:rPr>
+              <w:t>—</w:t>
+            </w:r>
+          </w:p>
+        </w:tc>
+        <w:tc>
+          <w:tcPr>
+            <w:tcW w:type="dxa" w:w="1728"/>
+          </w:tcPr>
+          <w:p>
+            <w:r>
+              <w:rPr>
+                <w:sz w:val="18"/>
+              </w:rPr>
+            </w:r>
+            <w:r>
+              <w:rPr>
+                <w:sz w:val="18"/>
+              </w:rPr>
+              <w:t>~~RAG #1 literatura~~</w:t>
+            </w:r>
+          </w:p>
+        </w:tc>
+      </w:tr>
+      <w:tr>
+        <w:tc>
+          <w:tcPr>
+            <w:tcW w:type="dxa" w:w="1728"/>
           </w:tcPr>
           <w:p>
             <w:r>
@@ -819,7 +1084,7 @@
         </w:tc>
         <w:tc>
           <w:tcPr>
-            <w:tcW w:type="dxa" w:w="2160"/>
+            <w:tcW w:type="dxa" w:w="1728"/>
           </w:tcPr>
           <w:p>
             <w:r>
@@ -838,7 +1103,7 @@
         </w:tc>
         <w:tc>
           <w:tcPr>
-            <w:tcW w:type="dxa" w:w="2160"/>
+            <w:tcW w:type="dxa" w:w="1728"/>
           </w:tcPr>
           <w:p>
             <w:r>
@@ -856,7 +1121,25 @@
         </w:tc>
         <w:tc>
           <w:tcPr>
-            <w:tcW w:type="dxa" w:w="2160"/>
+            <w:tcW w:type="dxa" w:w="1728"/>
+          </w:tcPr>
+          <w:p>
+            <w:r>
+              <w:rPr>
+                <w:sz w:val="18"/>
+              </w:rPr>
+            </w:r>
+            <w:r>
+              <w:rPr>
+                <w:sz w:val="18"/>
+              </w:rPr>
+              <w:t>—</w:t>
+            </w:r>
+          </w:p>
+        </w:tc>
+        <w:tc>
+          <w:tcPr>
+            <w:tcW w:type="dxa" w:w="1728"/>
           </w:tcPr>
           <w:p>
             <w:r>
@@ -873,110 +1156,36 @@
           </w:p>
         </w:tc>
       </w:tr>
-      <w:tr>
-        <w:tc>
-          <w:tcPr>
-            <w:tcW w:type="dxa" w:w="2160"/>
-          </w:tcPr>
-          <w:p>
-            <w:r>
-              <w:rPr>
-                <w:sz w:val="18"/>
-              </w:rPr>
-            </w:r>
-            <w:r>
-              <w:rPr>
-                <w:sz w:val="18"/>
-              </w:rPr>
-              <w:t>🗑️</w:t>
-            </w:r>
-          </w:p>
-        </w:tc>
-        <w:tc>
-          <w:tcPr>
-            <w:tcW w:type="dxa" w:w="2160"/>
-          </w:tcPr>
-          <w:p>
-            <w:r>
-              <w:rPr>
-                <w:sz w:val="18"/>
-              </w:rPr>
-            </w:r>
-            <w:r>
-              <w:rPr>
-                <w:sz w:val="18"/>
-              </w:rPr>
-              <w:t>~~ANVISA Medicamentos (CSV)~~</w:t>
-            </w:r>
-          </w:p>
-        </w:tc>
-        <w:tc>
-          <w:tcPr>
-            <w:tcW w:type="dxa" w:w="2160"/>
-          </w:tcPr>
-          <w:p>
-            <w:r>
-              <w:rPr>
-                <w:sz w:val="18"/>
-              </w:rPr>
-            </w:r>
-            <w:r>
-              <w:rPr>
-                <w:b/>
-                <w:sz w:val="18"/>
-              </w:rPr>
-              <w:t>SUBSTITUÍDO por ChatBulário</w:t>
-            </w:r>
-          </w:p>
-        </w:tc>
-        <w:tc>
-          <w:tcPr>
-            <w:tcW w:type="dxa" w:w="2160"/>
-          </w:tcPr>
-          <w:p>
-            <w:r>
-              <w:rPr>
-                <w:sz w:val="18"/>
-              </w:rPr>
-            </w:r>
-            <w:r>
-              <w:rPr>
-                <w:sz w:val="18"/>
-              </w:rPr>
-              <w:t>~~RAG #2 metadados~~</w:t>
-            </w:r>
-          </w:p>
-        </w:tc>
-      </w:tr>
     </w:tbl>
     <w:p>
       <w:r>
         <w:rPr>
           <w:b/>
         </w:rPr>
-        <w:t>⭐ ATUALIZAÇÃO AGO/2026</w:t>
+        <w:t>⭐ ATUALIZAÇÃO SET/2026</w:t>
       </w:r>
       <w:r>
-        <w:t xml:space="preserve">: O dataset </w:t>
+        <w:t xml:space="preserve">: Limpeza completa do repositório. Agora só temos 4 datasets ativos. Os demais foram removidos do </w:t>
       </w:r>
       <w:r>
         <w:rPr>
           <w:rFonts w:ascii="Consolas" w:hAnsi="Consolas"/>
           <w:sz w:val="20"/>
         </w:rPr>
-        <w:t>anvisa_medicamentos.csv</w:t>
+        <w:t>data/raw/</w:t>
       </w:r>
       <w:r>
-        <w:t xml:space="preserve"> (que só tinha metadados: nome do remédio, classe terapêutica, registro) foi </w:t>
+        <w:t xml:space="preserve"> (liberou ~500 MB). Use o script automático </w:t>
       </w:r>
       <w:r>
         <w:rPr>
-          <w:b/>
+          <w:rFonts w:ascii="Consolas" w:hAnsi="Consolas"/>
+          <w:sz w:val="20"/>
         </w:rPr>
-        <w:t>substituído pelo ChatBulário</w:t>
+        <w:t>scripts/setup_data_colab.py</w:t>
       </w:r>
       <w:r>
-        <w:t xml:space="preserve"> (pares pergunta-resposta com texto completo das bulas em PT-BR, 9 seções da RDC 47/2009). Detalhes na seção "ChatBulário" abaixo.</w:t>
+        <w:t xml:space="preserve"> para baixar tudo.</w:t>
       </w:r>
     </w:p>
     <w:p>
@@ -1000,315 +1209,14 @@
     </w:p>
     <w:p>
       <w:pPr>
-        <w:pStyle w:val="Heading3"/>
+        <w:ind w:left="432" w:right="432"/>
       </w:pPr>
       <w:r>
         <w:rPr>
-          <w:color w:val="1F4E79"/>
+          <w:i/>
+          <w:color w:val="555555"/>
         </w:rPr>
-        <w:t>1. **PubMedQA** (biomedical yes/no/maybe QA)</w:t>
-      </w:r>
-    </w:p>
-    <w:p>
-      <w:pPr>
-        <w:pStyle w:val="ListBullet"/>
-      </w:pPr>
-      <w:r>
-        <w:rPr>
-          <w:b/>
-        </w:rPr>
-        <w:t>Por que</w:t>
-      </w:r>
-      <w:r>
-        <w:t>: complementar MedQuAD no fine-tuning, formato pergunta→resposta curta</w:t>
-      </w:r>
-    </w:p>
-    <w:p>
-      <w:pPr>
-        <w:pStyle w:val="ListBullet"/>
-      </w:pPr>
-      <w:r>
-        <w:rPr>
-          <w:b/>
-        </w:rPr>
-        <w:t>Link</w:t>
-      </w:r>
-      <w:r>
-        <w:t>: https://huggingface.co/datasets/qiaojin/PubMedQA</w:t>
-      </w:r>
-    </w:p>
-    <w:p>
-      <w:pPr>
-        <w:pStyle w:val="ListBullet"/>
-      </w:pPr>
-      <w:r>
-        <w:rPr>
-          <w:b/>
-        </w:rPr>
-        <w:t>Tamanho</w:t>
-      </w:r>
-      <w:r>
-        <w:t>: ~300 MB (273k amostras)</w:t>
-      </w:r>
-    </w:p>
-    <w:p>
-      <w:pPr>
-        <w:pStyle w:val="ListBullet"/>
-      </w:pPr>
-      <w:r>
-        <w:rPr>
-          <w:b/>
-        </w:rPr>
-        <w:t>Formato</w:t>
-      </w:r>
-      <w:r>
-        <w:t xml:space="preserve">: HuggingFace dataset (carrega com </w:t>
-      </w:r>
-      <w:r>
-        <w:rPr>
-          <w:rFonts w:ascii="Consolas" w:hAnsi="Consolas"/>
-          <w:sz w:val="20"/>
-        </w:rPr>
-        <w:t>datasets.load_dataset()</w:t>
-      </w:r>
-      <w:r>
-        <w:t>)</w:t>
-      </w:r>
-    </w:p>
-    <w:p>
-      <w:pPr>
-        <w:pStyle w:val="ListBullet"/>
-      </w:pPr>
-      <w:r>
-        <w:rPr>
-          <w:b/>
-        </w:rPr>
-        <w:t>Download direto via Python</w:t>
-      </w:r>
-      <w:r>
-        <w:t>:</w:t>
-      </w:r>
-    </w:p>
-    <w:p>
-      <w:r>
-        <w:rPr>
-          <w:rFonts w:ascii="Consolas" w:hAnsi="Consolas"/>
-          <w:sz w:val="18"/>
-        </w:rPr>
-        <w:t>from datasets import load_dataset</w:t>
-        <w:br/>
-        <w:t>ds = load_dataset("qiaojin/PubMedQA", "pqa_labeled")</w:t>
-        <w:br/>
-        <w:t># ou</w:t>
-        <w:br/>
-        <w:t>ds = load_dataset("qiaojin/PubMedQA", "pqa_artificial")  # 211k geradas</w:t>
-      </w:r>
-    </w:p>
-    <w:p>
-      <w:pPr>
-        <w:pStyle w:val="Heading3"/>
-      </w:pPr>
-      <w:r>
-        <w:rPr>
-          <w:color w:val="1F4E79"/>
-        </w:rPr>
-        <w:t>2. **PubMed Central (PMC) Open Access Subset**</w:t>
-      </w:r>
-    </w:p>
-    <w:p>
-      <w:pPr>
-        <w:pStyle w:val="ListBullet"/>
-      </w:pPr>
-      <w:r>
-        <w:rPr>
-          <w:b/>
-        </w:rPr>
-        <w:t>Por que</w:t>
-      </w:r>
-      <w:r>
-        <w:t>: base de literatura científica pro RAG #1</w:t>
-      </w:r>
-    </w:p>
-    <w:p>
-      <w:pPr>
-        <w:pStyle w:val="ListBullet"/>
-      </w:pPr>
-      <w:r>
-        <w:rPr>
-          <w:b/>
-        </w:rPr>
-        <w:t>Link FTP</w:t>
-      </w:r>
-      <w:r>
-        <w:t>: https://ftp.ncbi.nlm.nih.gov/pub/pmc/oa_bulk/</w:t>
-      </w:r>
-    </w:p>
-    <w:p>
-      <w:pPr>
-        <w:pStyle w:val="ListBullet"/>
-      </w:pPr>
-      <w:r>
-        <w:rPr>
-          <w:b/>
-        </w:rPr>
-        <w:t>Tamanho</w:t>
-      </w:r>
-      <w:r>
-        <w:t>: ~3.5 milhões de artigos (vários GBs!) — pegar só subset</w:t>
-      </w:r>
-    </w:p>
-    <w:p>
-      <w:pPr>
-        <w:pStyle w:val="ListBullet"/>
-      </w:pPr>
-      <w:r>
-        <w:rPr>
-          <w:b/>
-        </w:rPr>
-        <w:t>Como pegar subset pequeno</w:t>
-      </w:r>
-      <w:r>
-        <w:t>:</w:t>
-      </w:r>
-    </w:p>
-    <w:p>
-      <w:r>
-        <w:rPr>
-          <w:rFonts w:ascii="Consolas" w:hAnsi="Consolas"/>
-          <w:sz w:val="18"/>
-        </w:rPr>
-        <w:t># ~50k artigos (vai ser suficiente pra Tech Challenge)</w:t>
-        <w:br/>
-        <w:t>curl -O https://ftp.ncbi.nlm.nih.gov/pub/pmc/oa_bulk/oa_comm/xml/oa_comm_xml.PMC001xxxxxx.baseline.2024-12-18.tar.gz</w:t>
-        <w:br/>
-        <w:t># Repetir para outros arquivos .baseline.tar.gz</w:t>
-      </w:r>
-    </w:p>
-    <w:p>
-      <w:pPr>
-        <w:pStyle w:val="ListBullet"/>
-      </w:pPr>
-      <w:r>
-        <w:rPr>
-          <w:b/>
-        </w:rPr>
-        <w:t>Alternativa menor (recomendada)</w:t>
-      </w:r>
-      <w:r>
-        <w:t>: usar a API BioC em vez de FTP</w:t>
-      </w:r>
-    </w:p>
-    <w:p>
-      <w:r>
-        <w:rPr>
-          <w:rFonts w:ascii="Consolas" w:hAnsi="Consolas"/>
-          <w:sz w:val="18"/>
-        </w:rPr>
-        <w:t># Exemplo: pegar 1000 artigos sobre "diabetes"</w:t>
-        <w:br/>
-        <w:t>import requests</w:t>
-        <w:br/>
-        <w:t># https://www.ncbi.nlm.nih.gov/research/bionlp/RESTful/pmcoa.cgi/BioC_json/PMC1234567/unicode</w:t>
-      </w:r>
-    </w:p>
-    <w:p>
-      <w:pPr>
-        <w:pStyle w:val="Heading3"/>
-      </w:pPr>
-      <w:r>
-        <w:rPr>
-          <w:color w:val="1F4E79"/>
-        </w:rPr>
-        <w:t>3. **ANVISA — Medicamentos Registrados**</w:t>
-      </w:r>
-    </w:p>
-    <w:p>
-      <w:pPr>
-        <w:pStyle w:val="ListBullet"/>
-      </w:pPr>
-      <w:r>
-        <w:rPr>
-          <w:b/>
-        </w:rPr>
-        <w:t>Por que</w:t>
-      </w:r>
-      <w:r>
-        <w:t>: bulas de medicamentos brasileiros pro RAG #2</w:t>
-      </w:r>
-    </w:p>
-    <w:p>
-      <w:pPr>
-        <w:pStyle w:val="ListBullet"/>
-      </w:pPr>
-      <w:r>
-        <w:rPr>
-          <w:b/>
-        </w:rPr>
-        <w:t>Link</w:t>
-      </w:r>
-      <w:r>
-        <w:t>: https://dados.anvisa.gov.br/dados/</w:t>
-      </w:r>
-    </w:p>
-    <w:p>
-      <w:pPr>
-        <w:pStyle w:val="ListBullet"/>
-      </w:pPr>
-      <w:r>
-        <w:rPr>
-          <w:b/>
-        </w:rPr>
-        <w:t>Arquivo específico</w:t>
-      </w:r>
-      <w:r>
-        <w:t xml:space="preserve">: </w:t>
-      </w:r>
-      <w:r>
-        <w:rPr>
-          <w:rFonts w:ascii="Consolas" w:hAnsi="Consolas"/>
-          <w:sz w:val="20"/>
-        </w:rPr>
-        <w:t>DADOS_ABERTOS_MEDICAMENTOS.csv</w:t>
-      </w:r>
-      <w:r>
-        <w:t xml:space="preserve"> (~8 MB)</w:t>
-      </w:r>
-    </w:p>
-    <w:p>
-      <w:pPr>
-        <w:pStyle w:val="ListBullet"/>
-      </w:pPr>
-      <w:r>
-        <w:rPr>
-          <w:b/>
-        </w:rPr>
-        <w:t>Download direto</w:t>
-      </w:r>
-      <w:r>
-        <w:t>:</w:t>
-      </w:r>
-    </w:p>
-    <w:p>
-      <w:r>
-        <w:rPr>
-          <w:rFonts w:ascii="Consolas" w:hAnsi="Consolas"/>
-          <w:sz w:val="18"/>
-        </w:rPr>
-        <w:t>curl -O https://dados.anvisa.gov.br/dados/DADOS_ABERTOS_MEDICAMENTOS.csv</w:t>
-      </w:r>
-    </w:p>
-    <w:p>
-      <w:pPr>
-        <w:pStyle w:val="ListBullet"/>
-      </w:pPr>
-      <w:r>
-        <w:rPr>
-          <w:b/>
-        </w:rPr>
-        <w:t>Colunas principais</w:t>
-      </w:r>
-      <w:r>
-        <w:t>: NOME_PRODUTO, PRINCIPIO_ATIVO, CLASSE_TERAPEUTICA, etc.</w:t>
+        <w:t>┃ ⚠️ **SET/2026**: Seções 1 (PubMedQA), 2 (PMC) e 3 (ANVISA) foram removidas — esses datasets não fazem mais parte do pipeline. Use o **Setup Automático** no topo (`scripts/setup_data_colab.py`) ou siga as instruções das seções 4-6 abaixo para cada dataset ativo.</w:t>
       </w:r>
     </w:p>
     <w:p>
@@ -1836,127 +1744,7 @@
         <w:rPr>
           <w:color w:val="1F4E79"/>
         </w:rPr>
-        <w:t>6. **RxNorm** (medicamentos EUA — complementar ANVISA)</w:t>
-      </w:r>
-    </w:p>
-    <w:p>
-      <w:pPr>
-        <w:pStyle w:val="ListBullet"/>
-      </w:pPr>
-      <w:r>
-        <w:rPr>
-          <w:b/>
-        </w:rPr>
-        <w:t>Por que</w:t>
-      </w:r>
-      <w:r>
-        <w:t>: nomes genéricos, doses, interações em inglês</w:t>
-      </w:r>
-    </w:p>
-    <w:p>
-      <w:pPr>
-        <w:pStyle w:val="ListBullet"/>
-      </w:pPr>
-      <w:r>
-        <w:rPr>
-          <w:b/>
-        </w:rPr>
-        <w:t>Link</w:t>
-      </w:r>
-      <w:r>
-        <w:t>: https://www.nlm.nih.gov/research/umls/rxnorm/docs/rxnormfiles.html</w:t>
-      </w:r>
-    </w:p>
-    <w:p>
-      <w:pPr>
-        <w:pStyle w:val="ListBullet"/>
-      </w:pPr>
-      <w:r>
-        <w:rPr>
-          <w:b/>
-        </w:rPr>
-        <w:t>Download</w:t>
-      </w:r>
-      <w:r>
-        <w:t>: requer cadastro UMLS gratuito (UMLS Terminology Services)</w:t>
-      </w:r>
-    </w:p>
-    <w:p>
-      <w:pPr>
-        <w:pStyle w:val="ListBullet"/>
-      </w:pPr>
-      <w:r>
-        <w:rPr>
-          <w:b/>
-        </w:rPr>
-        <w:t>Tamanho</w:t>
-      </w:r>
-      <w:r>
-        <w:t>: ~2 GB</w:t>
-      </w:r>
-    </w:p>
-    <w:p>
-      <w:pPr>
-        <w:pStyle w:val="Heading3"/>
-      </w:pPr>
-      <w:r>
-        <w:rPr>
-          <w:color w:val="1F4E79"/>
-        </w:rPr>
-        <w:t>7. **DrugBank Open Data**</w:t>
-      </w:r>
-    </w:p>
-    <w:p>
-      <w:pPr>
-        <w:pStyle w:val="ListBullet"/>
-      </w:pPr>
-      <w:r>
-        <w:rPr>
-          <w:b/>
-        </w:rPr>
-        <w:t>Por que</w:t>
-      </w:r>
-      <w:r>
-        <w:t>: dataset aberto de medicamentos sob CC0</w:t>
-      </w:r>
-    </w:p>
-    <w:p>
-      <w:pPr>
-        <w:pStyle w:val="ListBullet"/>
-      </w:pPr>
-      <w:r>
-        <w:rPr>
-          <w:b/>
-        </w:rPr>
-        <w:t>Link</w:t>
-      </w:r>
-      <w:r>
-        <w:t>: https://go.drugbank.com/releases/latest</w:t>
-      </w:r>
-    </w:p>
-    <w:p>
-      <w:pPr>
-        <w:pStyle w:val="ListBullet"/>
-      </w:pPr>
-      <w:r>
-        <w:rPr>
-          <w:b/>
-        </w:rPr>
-        <w:t>Tamanho</w:t>
-      </w:r>
-      <w:r>
-        <w:t>: 204 MB (versão completa) ou 1 MB (vocabulário)</w:t>
-      </w:r>
-    </w:p>
-    <w:p>
-      <w:pPr>
-        <w:pStyle w:val="Heading3"/>
-      </w:pPr>
-      <w:r>
-        <w:rPr>
-          <w:color w:val="1F4E79"/>
-        </w:rPr>
-        <w:t>8. **MIMIC-III** (somente se quiser realismo máximo)</w:t>
+        <w:t>6. **MIMIC-III** (REJEITADO — burocrático)</w:t>
       </w:r>
     </w:p>
     <w:p>
@@ -1995,34 +1783,10 @@
         <w:rPr>
           <w:b/>
         </w:rPr>
-        <w:t>⚠️ Requer</w:t>
+        <w:t>⚠️ Rejeitado</w:t>
       </w:r>
       <w:r>
-        <w:t>:</w:t>
-      </w:r>
-    </w:p>
-    <w:p>
-      <w:pPr>
-        <w:pStyle w:val="ListNumber"/>
-      </w:pPr>
-      <w:r>
-        <w:t>Curso CITI "Data or Specimens Only Research" (gratuito, ~2h)</w:t>
-      </w:r>
-    </w:p>
-    <w:p>
-      <w:pPr>
-        <w:pStyle w:val="ListNumber"/>
-      </w:pPr>
-      <w:r>
-        <w:t>Conta no PhysioNet</w:t>
-      </w:r>
-    </w:p>
-    <w:p>
-      <w:pPr>
-        <w:pStyle w:val="ListNumber"/>
-      </w:pPr>
-      <w:r>
-        <w:t>Aprovação da aplicação (1-2 semanas)</w:t>
+        <w:t>: requer curso CITI + aprovação PhysioNet (1-2 semanas). Não compensa pro Tech Challenge.</w:t>
       </w:r>
     </w:p>
     <w:p>
@@ -2037,6 +1801,18 @@
       </w:r>
       <w:r>
         <w:t>: ~6 GB compactado</w:t>
+      </w:r>
+    </w:p>
+    <w:p>
+      <w:pPr>
+        <w:ind w:left="432" w:right="432"/>
+      </w:pPr>
+      <w:r>
+        <w:rPr>
+          <w:i/>
+          <w:color w:val="555555"/>
+        </w:rPr>
+        <w:t>┃ ⚠️ **SET/2026**: Seções 6 (RxNorm), 7 (DrugBank) foram removidas — não usadas no pipeline. Apenas MIMIC-III é mencionado como rejeitado por questões burocráticas.</w:t>
       </w:r>
     </w:p>
     <w:p>
@@ -2055,7 +1831,27 @@
         <w:rPr>
           <w:color w:val="2E74B5"/>
         </w:rPr>
-        <w:t>🎯 Plano de ação sugerido</w:t>
+        <w:t>🎯 Plano de ação sugerido (set/2026)</w:t>
+      </w:r>
+    </w:p>
+    <w:p>
+      <w:r>
+        <w:rPr>
+          <w:b/>
+        </w:rPr>
+        <w:t>Recomendação</w:t>
+      </w:r>
+      <w:r>
+        <w:t>: use o script automático — faz tudo em 10 min sem erro:</w:t>
+      </w:r>
+    </w:p>
+    <w:p>
+      <w:r>
+        <w:rPr>
+          <w:rFonts w:ascii="Consolas" w:hAnsi="Consolas"/>
+          <w:sz w:val="18"/>
+        </w:rPr>
+        <w:t>python scripts/setup_data_colab.py</w:t>
       </w:r>
     </w:p>
     <w:p>
@@ -2066,7 +1862,7 @@
         <w:rPr>
           <w:color w:val="1F4E79"/>
         </w:rPr>
-        <w:t>Rodada 1 — Essenciais (1-2h de downloads)</w:t>
+        <w:t>Manual (se preferir controle individual)</w:t>
       </w:r>
     </w:p>
     <w:p>
@@ -2075,24 +1871,28 @@
           <w:rFonts w:ascii="Consolas" w:hAnsi="Consolas"/>
           <w:sz w:val="18"/>
         </w:rPr>
-        <w:t># 1. PubMedQA (~300MB)</w:t>
+        <w:t># 1. MedQuAD (~23MB processado)</w:t>
         <w:br/>
-        <w:t>python -c "from datasets import load_dataset; load_dataset('qiaojin/PubMedQA', 'pqa_labeled')"</w:t>
+        <w:t>git clone https://github.com/abachaa/MedQuAD.git</w:t>
+        <w:br/>
+        <w:t>python src/data/01_anonimizar.py  # converte para medquad_finetuning.jsonl</w:t>
         <w:br/>
         <w:br/>
-        <w:t># 2. ANVISA Medicamentos (~8MB)</w:t>
+        <w:t># 2. ChatBulário (~200MB, 68k pares Q&amp;A)</w:t>
         <w:br/>
-        <w:t>curl -O https://dados.anvisa.gov.br/dados/DADOS_ABERTOS_MEDICAMENTOS.csv</w:t>
+        <w:t>python -c "from datasets import load_dataset; ds = load_dataset('walmeidadf/ChatBulario', cache_dir='data/raw')"</w:t>
         <w:br/>
         <w:br/>
-        <w:t># 3. Synthetic Clinical Notes (~50MB)</w:t>
+        <w:t># 3. Synthetic Clinical Notes (~11MB, 3k notas)</w:t>
         <w:br/>
         <w:t>python -c "from datasets import load_dataset; load_dataset('TonicAI/synthetic_clinical_notes')"</w:t>
         <w:br/>
         <w:br/>
-        <w:t># 4. CID-10 (~5MB)</w:t>
+        <w:t># 4. CID-10 (~1.3MB ou fallback 100 doenças)</w:t>
         <w:br/>
-        <w:t>curl -L -o cid10.csv https://raw.githubusercontent.com/cleytonferrari/CidDataSus/master/CIDImport/Repositorio/Resources/CID-10-CAPITULOS.CSV</w:t>
+        <w:t>curl -L -o data/raw/cid10_subcategorias.csv \</w:t>
+        <w:br/>
+        <w:t xml:space="preserve">  https://raw.githubusercontent.com/cleytonferrari/CidDataSus/master/CIDImport/Repositorio/Resources/CID-10-CAPITULOS.CSV</w:t>
       </w:r>
     </w:p>
     <w:p>
@@ -2103,88 +1903,132 @@
         <w:rPr>
           <w:color w:val="1F4E79"/>
         </w:rPr>
-        <w:t>Rodada 2 — PMC (1-2 dias pra processar)</w:t>
+        <w:t>Tempo total</w:t>
       </w:r>
     </w:p>
-    <w:p>
-      <w:pPr>
-        <w:pStyle w:val="ListBullet"/>
-      </w:pPr>
-      <w:r>
-        <w:t xml:space="preserve">Pegar 1 arquivo </w:t>
-      </w:r>
-      <w:r>
-        <w:rPr>
-          <w:rFonts w:ascii="Consolas" w:hAnsi="Consolas"/>
-          <w:sz w:val="20"/>
-        </w:rPr>
-        <w:t>.tar.gz</w:t>
-      </w:r>
-      <w:r>
-        <w:t xml:space="preserve"> do PMC OA (~5-10 GB)</w:t>
-      </w:r>
-    </w:p>
-    <w:p>
-      <w:pPr>
-        <w:pStyle w:val="ListBullet"/>
-      </w:pPr>
-      <w:r>
-        <w:t>Indexar com script que vou criar (</w:t>
-      </w:r>
-      <w:r>
-        <w:rPr>
-          <w:rFonts w:ascii="Consolas" w:hAnsi="Consolas"/>
-          <w:sz w:val="20"/>
-        </w:rPr>
-        <w:t>src/rag/build_index_pmc.py</w:t>
-      </w:r>
-      <w:r>
-        <w:t>)</w:t>
-      </w:r>
-    </w:p>
-    <w:p>
-      <w:pPr>
-        <w:pStyle w:val="ListBullet"/>
-      </w:pPr>
-      <w:r>
-        <w:t>Salvar em ChromaDB (chunking + embeddings)</w:t>
-      </w:r>
-    </w:p>
-    <w:p>
-      <w:pPr>
-        <w:pStyle w:val="Heading3"/>
-      </w:pPr>
-      <w:r>
-        <w:rPr>
-          <w:color w:val="1F4E79"/>
-        </w:rPr>
-        <w:t>Rodada 3 — OPCIONAL (MIMIC, se aprovado)</w:t>
-      </w:r>
-    </w:p>
-    <w:p>
-      <w:pPr>
-        <w:pStyle w:val="ListBullet"/>
-      </w:pPr>
-      <w:r>
-        <w:t>Aguardar aprovação PhysioNet</w:t>
-      </w:r>
-    </w:p>
-    <w:p>
-      <w:pPr>
-        <w:pStyle w:val="ListBullet"/>
-      </w:pPr>
-      <w:r>
-        <w:t>Baixar MIMIC-III/IV (~6 GB)</w:t>
-      </w:r>
-    </w:p>
-    <w:p>
-      <w:pPr>
-        <w:pStyle w:val="ListBullet"/>
-      </w:pPr>
-      <w:r>
-        <w:t>Refinar modelo com dados reais</w:t>
-      </w:r>
-    </w:p>
+    <w:tbl>
+      <w:tblPr>
+        <w:tblStyle w:val="LightGrid-Accent1"/>
+        <w:tblW w:type="auto" w:w="0"/>
+        <w:tblLook w:firstColumn="1" w:firstRow="1" w:lastColumn="0" w:lastRow="0" w:noHBand="0" w:noVBand="1" w:val="04A0"/>
+      </w:tblPr>
+      <w:tblGrid>
+        <w:gridCol w:w="4320"/>
+        <w:gridCol w:w="4320"/>
+      </w:tblGrid>
+      <w:tr>
+        <w:tc>
+          <w:tcPr>
+            <w:tcW w:type="dxa" w:w="4320"/>
+            <w:shd w:fill="1F497D"/>
+          </w:tcPr>
+          <w:p>
+            <w:r/>
+            <w:r>
+              <w:rPr>
+                <w:b/>
+                <w:color w:val="FFFFFF"/>
+                <w:sz w:val="20"/>
+              </w:rPr>
+              <w:t>Etapa</w:t>
+            </w:r>
+          </w:p>
+        </w:tc>
+        <w:tc>
+          <w:tcPr>
+            <w:tcW w:type="dxa" w:w="4320"/>
+            <w:shd w:fill="1F497D"/>
+          </w:tcPr>
+          <w:p>
+            <w:r/>
+            <w:r>
+              <w:rPr>
+                <w:b/>
+                <w:color w:val="FFFFFF"/>
+                <w:sz w:val="20"/>
+              </w:rPr>
+              <w:t>Tempo</w:t>
+            </w:r>
+          </w:p>
+        </w:tc>
+      </w:tr>
+      <w:tr>
+        <w:tc>
+          <w:tcPr>
+            <w:tcW w:type="dxa" w:w="4320"/>
+          </w:tcPr>
+          <w:p>
+            <w:r>
+              <w:rPr>
+                <w:sz w:val="18"/>
+              </w:rPr>
+            </w:r>
+            <w:r>
+              <w:rPr>
+                <w:sz w:val="18"/>
+              </w:rPr>
+              <w:t>Setup automático (1 comando)</w:t>
+            </w:r>
+          </w:p>
+        </w:tc>
+        <w:tc>
+          <w:tcPr>
+            <w:tcW w:type="dxa" w:w="4320"/>
+          </w:tcPr>
+          <w:p>
+            <w:r>
+              <w:rPr>
+                <w:sz w:val="18"/>
+              </w:rPr>
+            </w:r>
+            <w:r>
+              <w:rPr>
+                <w:sz w:val="18"/>
+              </w:rPr>
+              <w:t>~10 min</w:t>
+            </w:r>
+          </w:p>
+        </w:tc>
+      </w:tr>
+      <w:tr>
+        <w:tc>
+          <w:tcPr>
+            <w:tcW w:type="dxa" w:w="4320"/>
+          </w:tcPr>
+          <w:p>
+            <w:r>
+              <w:rPr>
+                <w:sz w:val="18"/>
+              </w:rPr>
+            </w:r>
+            <w:r>
+              <w:rPr>
+                <w:sz w:val="18"/>
+              </w:rPr>
+              <w:t>Manual (4 comandos separados)</w:t>
+            </w:r>
+          </w:p>
+        </w:tc>
+        <w:tc>
+          <w:tcPr>
+            <w:tcW w:type="dxa" w:w="4320"/>
+          </w:tcPr>
+          <w:p>
+            <w:r>
+              <w:rPr>
+                <w:sz w:val="18"/>
+              </w:rPr>
+            </w:r>
+            <w:r>
+              <w:rPr>
+                <w:sz w:val="18"/>
+              </w:rPr>
+              <w:t>~15 min</w:t>
+            </w:r>
+          </w:p>
+        </w:tc>
+      </w:tr>
+    </w:tbl>
     <w:p>
       <w:r>
         <w:rPr>
@@ -2201,7 +2045,7 @@
         <w:rPr>
           <w:color w:val="2E74B5"/>
         </w:rPr>
-        <w:t>📁 Onde salvar no projeto</w:t>
+        <w:t>📁 Onde salvar no projeto (estrutura atual set/2026)</w:t>
       </w:r>
     </w:p>
     <w:p>
@@ -2239,29 +2083,35 @@
         <w:br/>
         <w:t>├── raw/</w:t>
         <w:br/>
-        <w:t>│   ├── medquad_finetuning.jsonl        ✅ já tem</w:t>
+        <w:t>│   ├── medquad_finetuning.jsonl           ✅ ativo (fine-tuning)</w:t>
         <w:br/>
-        <w:t>│   ├── pubmedqa/                       🔲 criar</w:t>
+        <w:t>│   ├── chatbulario_train.jsonl            ✅ ativo (RAG #1, 10k indexadas)</w:t>
         <w:br/>
-        <w:t>│   │   └── pubmedqa_labeled.json</w:t>
+        <w:t>│   ├── chatbulario_validation.jsonl       ✅ ativo (avaliação)</w:t>
         <w:br/>
-        <w:t>│   ├── pmc_subset/                     🔲 criar (artigos extraídos)</w:t>
+        <w:t>│   ├── chatbulario_test.jsonl             ✅ ativo (avaliação)</w:t>
         <w:br/>
-        <w:t>│   ├── anvisa_medicamentos.csv         🔲 baixar</w:t>
+        <w:t>│   ├── synthetic_clinical_notes/          ✅ ativo (RAG #3, 1k notas)</w:t>
         <w:br/>
-        <w:t>│   ├── synthetic_clinical_notes/       🔲 criar</w:t>
-        <w:br/>
-        <w:t>│   └── cid10.csv                       🔲 baixar</w:t>
+        <w:t>│   └── cid10_subcategorias.csv            ✅ ativo (RAG #2)</w:t>
         <w:br/>
         <w:t>└── processed/</w:t>
         <w:br/>
-        <w:t xml:space="preserve">    ├── medquad_anonimizado.jsonl       ✅ já tem</w:t>
+        <w:t xml:space="preserve">    ├── train.jsonl                        ✅ (fine-tuning splits)</w:t>
         <w:br/>
-        <w:t xml:space="preserve">    ├── train.jsonl                     ✅ já tem</w:t>
+        <w:t xml:space="preserve">    ├── val.jsonl                          ✅</w:t>
         <w:br/>
-        <w:t xml:space="preserve">    ├── val.jsonl                       ✅ já tem</w:t>
+        <w:t xml:space="preserve">    ├── test.jsonl                         ✅</w:t>
         <w:br/>
-        <w:t xml:space="preserve">    └── test.jsonl                      ✅ já tem</w:t>
+        <w:t xml:space="preserve">    ├── synthetic_clinical_notes_anonimizado.jsonl  ✅</w:t>
+        <w:br/>
+        <w:t xml:space="preserve">    └── chroma_index/                      ✅ (ChromaDB indexado)</w:t>
+        <w:br/>
+        <w:t xml:space="preserve">        ├── chatbulario/    (10k docs)</w:t>
+        <w:br/>
+        <w:t xml:space="preserve">        ├── cid10/          (22 códigos)</w:t>
+        <w:br/>
+        <w:t xml:space="preserve">        └── synthetic/      (1k notas)</w:t>
       </w:r>
     </w:p>
     <w:p>
@@ -2280,7 +2130,7 @@
         <w:rPr>
           <w:color w:val="2E74B5"/>
         </w:rPr>
-        <w:t>✅ Checklist de downloads</w:t>
+        <w:t>✅ Checklist de downloads (set/2026)</w:t>
       </w:r>
     </w:p>
     <w:p>
@@ -2288,17 +2138,26 @@
         <w:pStyle w:val="ListBullet"/>
       </w:pPr>
       <w:r>
-        <w:t xml:space="preserve">[ ] PubMedQA (rodar </w:t>
+        <w:t xml:space="preserve">[x] </w:t>
+      </w:r>
+      <w:r>
+        <w:rPr>
+          <w:b/>
+        </w:rPr>
+        <w:t>MedQuAD</w:t>
+      </w:r>
+      <w:r>
+        <w:t xml:space="preserve"> (via </w:t>
       </w:r>
       <w:r>
         <w:rPr>
           <w:rFonts w:ascii="Consolas" w:hAnsi="Consolas"/>
           <w:sz w:val="20"/>
         </w:rPr>
-        <w:t>load_dataset</w:t>
+        <w:t>scripts/setup_data_colab.py</w:t>
       </w:r>
       <w:r>
-        <w:t xml:space="preserve"> no Colab ou local)</w:t>
+        <w:t>)</w:t>
       </w:r>
     </w:p>
     <w:p>
@@ -2306,7 +2165,26 @@
         <w:pStyle w:val="ListBullet"/>
       </w:pPr>
       <w:r>
-        <w:t>[ ] ANVISA Medicamentos CSV</w:t>
+        <w:t xml:space="preserve">[x] </w:t>
+      </w:r>
+      <w:r>
+        <w:rPr>
+          <w:b/>
+        </w:rPr>
+        <w:t>ChatBulário</w:t>
+      </w:r>
+      <w:r>
+        <w:t xml:space="preserve"> (via </w:t>
+      </w:r>
+      <w:r>
+        <w:rPr>
+          <w:rFonts w:ascii="Consolas" w:hAnsi="Consolas"/>
+          <w:sz w:val="20"/>
+        </w:rPr>
+        <w:t>scripts/setup_data_colab.py</w:t>
+      </w:r>
+      <w:r>
+        <w:t>)</w:t>
       </w:r>
     </w:p>
     <w:p>
@@ -2314,7 +2192,26 @@
         <w:pStyle w:val="ListBullet"/>
       </w:pPr>
       <w:r>
-        <w:t>[ ] Synthetic Clinical Notes (HuggingFace)</w:t>
+        <w:t xml:space="preserve">[x] </w:t>
+      </w:r>
+      <w:r>
+        <w:rPr>
+          <w:b/>
+        </w:rPr>
+        <w:t>Synthetic Clinical Notes</w:t>
+      </w:r>
+      <w:r>
+        <w:t xml:space="preserve"> (via </w:t>
+      </w:r>
+      <w:r>
+        <w:rPr>
+          <w:rFonts w:ascii="Consolas" w:hAnsi="Consolas"/>
+          <w:sz w:val="20"/>
+        </w:rPr>
+        <w:t>scripts/setup_data_colab.py</w:t>
+      </w:r>
+      <w:r>
+        <w:t>)</w:t>
       </w:r>
     </w:p>
     <w:p>
@@ -2322,7 +2219,26 @@
         <w:pStyle w:val="ListBullet"/>
       </w:pPr>
       <w:r>
-        <w:t>[ ] CID-10 CSV</w:t>
+        <w:t xml:space="preserve">[x] </w:t>
+      </w:r>
+      <w:r>
+        <w:rPr>
+          <w:b/>
+        </w:rPr>
+        <w:t>CID-10</w:t>
+      </w:r>
+      <w:r>
+        <w:t xml:space="preserve"> (via </w:t>
+      </w:r>
+      <w:r>
+        <w:rPr>
+          <w:rFonts w:ascii="Consolas" w:hAnsi="Consolas"/>
+          <w:sz w:val="20"/>
+        </w:rPr>
+        <w:t>scripts/setup_data_colab.py</w:t>
+      </w:r>
+      <w:r>
+        <w:t xml:space="preserve"> com fallback)</w:t>
       </w:r>
     </w:p>
     <w:p>
@@ -2330,15 +2246,47 @@
         <w:pStyle w:val="ListBullet"/>
       </w:pPr>
       <w:r>
-        <w:t>[ ] PMC subset (opcional, pesado)</w:t>
+        <w:t xml:space="preserve">[x] </w:t>
+      </w:r>
+      <w:r>
+        <w:rPr>
+          <w:b/>
+        </w:rPr>
+        <w:t>ChromaDB indexado</w:t>
+      </w:r>
+      <w:r>
+        <w:t xml:space="preserve"> (via </w:t>
+      </w:r>
+      <w:r>
+        <w:rPr>
+          <w:rFonts w:ascii="Consolas" w:hAnsi="Consolas"/>
+          <w:sz w:val="20"/>
+        </w:rPr>
+        <w:t>python src/rag/build_index_chatbulario.py 10000</w:t>
+      </w:r>
+      <w:r>
+        <w:t>)</w:t>
       </w:r>
     </w:p>
     <w:p>
-      <w:pPr>
-        <w:pStyle w:val="ListBullet"/>
-      </w:pPr>
       <w:r>
-        <w:t>[ ] MIMIC-III (opcional, burocrático)</w:t>
+        <w:rPr>
+          <w:b/>
+        </w:rPr>
+        <w:t>Tudo automatizado</w:t>
+      </w:r>
+      <w:r>
+        <w:t xml:space="preserve"> — basta rodar </w:t>
+      </w:r>
+      <w:r>
+        <w:rPr>
+          <w:rFonts w:ascii="Consolas" w:hAnsi="Consolas"/>
+          <w:sz w:val="20"/>
+        </w:rPr>
+        <w:t>scripts/setup_data_colab.py</w:t>
+      </w:r>
+      <w:r>
+        <w:t xml:space="preserve"> no Colab.</w:t>
       </w:r>
     </w:p>
     <w:sectPr>

</xml_diff>